<commit_message>
docs: update project summary document and word docx with student roles for Shivanshu Yadav
</commit_message>
<xml_diff>
--- a/docs/NetSage_AI_Project_Summary_Document.docx
+++ b/docs/NetSage_AI_Project_Summary_Document.docx
@@ -147,6 +147,35 @@
                 <w:b/>
                 <w:sz w:val="21"/>
               </w:rPr>
+              <w:t>Program:</w:t>
+            </w:r>
+          </w:p>
+        </w:tc>
+        <w:tc>
+          <w:tcPr>
+            <w:tcW w:type="dxa" w:w="4680"/>
+          </w:tcPr>
+          <w:p>
+            <w:r>
+              <w:rPr>
+                <w:sz w:val="21"/>
+              </w:rPr>
+              <w:t>Cisco AICTE Virtual Internship Program 2026</w:t>
+            </w:r>
+          </w:p>
+        </w:tc>
+      </w:tr>
+      <w:tr>
+        <w:tc>
+          <w:tcPr>
+            <w:tcW w:type="dxa" w:w="4680"/>
+          </w:tcPr>
+          <w:p>
+            <w:r>
+              <w:rPr>
+                <w:b/>
+                <w:sz w:val="21"/>
+              </w:rPr>
               <w:t>Problem Statement:</w:t>
             </w:r>
           </w:p>
@@ -205,7 +234,7 @@
                 <w:b/>
                 <w:sz w:val="21"/>
               </w:rPr>
-              <w:t>Submission Date:</w:t>
+              <w:t>Tech Guides:</w:t>
             </w:r>
           </w:p>
         </w:tc>
@@ -218,7 +247,7 @@
               <w:rPr>
                 <w:sz w:val="21"/>
               </w:rPr>
-              <w:t>August 2026</w:t>
+              <w:t>Mr. Lilesh Pathe &amp; Ms. Kuhu Sabui</w:t>
             </w:r>
           </w:p>
         </w:tc>
@@ -263,11 +292,11 @@
         <w:br/>
         <w:t>• Deterministic Engine (src/checker.py): High-speed regex checks providing 100% mathematical guarantees for known static errors.</w:t>
         <w:br/>
-        <w:t>• Diagnostic Core (src/engine.py &amp; prompts/diagnose_prompt.md): Prompt orchestrator enforcing strict JSON output schema and Pydantic validation.</w:t>
+        <w:t>• Diagnostic Core (src/engine.py &amp; prompts/diagnose_prompt.md): Prompt orchestrator supporting Google Gemini (gemini-2.5-flash) and offline synthesis, enforcing strict Pydantic JSON validation.</w:t>
         <w:br/>
-        <w:t>• Human-in-the-Loop Gateway (src/app.py): Streamlit dashboard with interactive Approve, Edit CLI, and Reject decision gates.</w:t>
+        <w:t>• Human-in-the-Loop Gateway (src/app.py): Unified Streamlit dashboard with interactive Approve, Edit CLI, and Reject decision gates.</w:t>
         <w:br/>
-        <w:t>• Governance &amp; Audit (docs/model_audit_log.md): Tracks agreement rates and documents 5 in-depth human override case studies.</w:t>
+        <w:t>• Governance &amp; Audit (docs/model_audit_log.md): Tracks agreement rates, records command diffs, and documents 5 in-depth human override case studies.</w:t>
       </w:r>
     </w:p>
     <w:p>
@@ -522,7 +551,31 @@
         <w:pStyle w:val="Heading1"/>
       </w:pPr>
       <w:r>
-        <w:t>5. Conclusion</w:t>
+        <w:t>5. Individual Student Contributions &amp; Engineering Roles</w:t>
+      </w:r>
+    </w:p>
+    <w:p>
+      <w:r>
+        <w:t>Author: Shivanshu Yadav | Role: Lead AI &amp; NetDevOps Engineer</w:t>
+        <w:br/>
+        <w:br/>
+        <w:t>1. Dataset Engineering: Curated and formatted all 30 Cisco Packet Tracer multi-layer failure scenarios in data/cases.csv.</w:t>
+        <w:br/>
+        <w:t>2. Deterministic Engine: Developed src/checker.py with Python regex and subnet math logic, achieving 100.0% coverage.</w:t>
+        <w:br/>
+        <w:t>3. Prompt &amp; Schema Engineering: Authored few-shot prompts (prompts/diagnose_prompt.md) and Pydantic schema validation (src/engine.py).</w:t>
+        <w:br/>
+        <w:t>4. Full-Stack Web Platform: Built the unified Streamlit application (src/app.py) with dual-theme design, full-width certified CLI blocks, and persistent .env API key storage.</w:t>
+        <w:br/>
+        <w:t>5. Governance &amp; Auditing: Designed the Human-in-the-Loop verification gate and documented 5 edge-case overrides in docs/model_audit_log.md.</w:t>
+      </w:r>
+    </w:p>
+    <w:p>
+      <w:pPr>
+        <w:pStyle w:val="Heading1"/>
+      </w:pPr>
+      <w:r>
+        <w:t>6. Conclusion</w:t>
       </w:r>
     </w:p>
     <w:p>

</xml_diff>